<commit_message>
docs: documentação do desenvolvimento da fase 1 do projeto cabiNet
</commit_message>
<xml_diff>
--- a/docs/01-levantamento-estado-atual-fase-1.docx
+++ b/docs/01-levantamento-estado-atual-fase-1.docx
@@ -9669,7 +9669,7 @@
                 <w:color w:val="1E293B"/>
                 <w:sz w:val="19"/>
               </w:rPr>
-              <w:t>No código/docs do repo: sobe manual (uvicorn / make run / Makefile). Não há no repositório instalador de serviço Windows. Como está no PC do totem no dia a dia: ___ (preencher: terminal manual, atalho, serviço Windows, etc.).</w:t>
+              <w:t>Manual por terminal (não há serviço Windows / NSSM / Task Scheduler no repo). No dia a dia: (1) cabine-core: docker compose up -d → uv run alembic upgrade head → uv run uvicorn app.main:app --reload --port 8000; (2) em outro terminal, cabine-web: npm run dev -- --host 127.0.0.1 --port 5174. Navegador em modo quiosque apontando para o front.</w:t>
             </w:r>
           </w:p>
         </w:tc>
@@ -11661,7 +11661,7 @@
                 <w:color w:val="1E293B"/>
                 <w:sz w:val="19"/>
               </w:rPr>
-              <w:t>___</w:t>
+              <w:t>(1) Quais dispositivos serão oficiais em produção (lista fechada) vs. o admin cadastrar novos ao longo do uso? (2) O cadastro de dispositivos no /admin cobre o que o produto precisa, ou falta algo? (3) Em qual SO a cabine sobe de forma definitiva (só Windows do totem)? (4) Precisa funcionar offline (sem rede / sem Postgres remoto)?</w:t>
             </w:r>
           </w:p>
         </w:tc>
@@ -11703,7 +11703,7 @@
           <w:color w:val="1E293B"/>
           <w:sz w:val="20"/>
         </w:rPr>
-        <w:t>☐  Árvore de pastas completa de cada parte (tree ou print)</w:t>
+        <w:t>[x] Árvore de pastas — anexos: docs/anexo-arvore-cabine-core-app.txt, anexo-arvore-cabine-web-src.txt, anexo-arvore-cabine-profissional-src.txt</w:t>
       </w:r>
     </w:p>
     <w:p>
@@ -11823,7 +11823,7 @@
           <w:color w:val="1E293B"/>
           <w:sz w:val="20"/>
         </w:rPr>
-        <w:t>☐  Textos exibidos ao participante (resultado, avisos) — existem no repo (advice/, módulos); anexar se pedido</w:t>
+        <w:t>[x] Textos exibidos ao participante — no repo: cabine-web/src/advice/, modules/health/, modules/mental/ (docs/anexo-arvore-*.txt também gerados)</w:t>
       </w:r>
     </w:p>
     <w:p>

</xml_diff>